<commit_message>
Added gyro to schematic sheet, improved motor function
</commit_message>
<xml_diff>
--- a/schematics.docx
+++ b/schematics.docx
@@ -969,144 +969,115 @@
       </w:r>
     </w:p>
     <w:p>
-      <w:r>
-        <w:t xml:space="preserve">Sudo </w:t>
-      </w:r>
-      <w:proofErr w:type="spellStart"/>
-      <w:r>
-        <w:t>raspi</w:t>
-      </w:r>
-      <w:proofErr w:type="spellEnd"/>
-      <w:r>
-        <w:t>-config -&gt; interface option -&gt; enable serial</w:t>
-      </w:r>
-    </w:p>
-    <w:p/>
-    <w:p>
-      <w:proofErr w:type="spellStart"/>
-      <w:r>
-        <w:t>sudo</w:t>
-      </w:r>
-      <w:proofErr w:type="spellEnd"/>
-      <w:r>
-        <w:t xml:space="preserve"> </w:t>
-      </w:r>
-      <w:proofErr w:type="spellStart"/>
-      <w:r>
-        <w:t>systemctl</w:t>
-      </w:r>
-      <w:proofErr w:type="spellEnd"/>
-      <w:r>
-        <w:t xml:space="preserve"> stop </w:t>
-      </w:r>
-      <w:proofErr w:type="spellStart"/>
-      <w:r>
-        <w:t>dhcpcd</w:t>
-      </w:r>
-      <w:proofErr w:type="spellEnd"/>
-    </w:p>
-    <w:p>
-      <w:proofErr w:type="spellStart"/>
-      <w:r>
-        <w:t>sudo</w:t>
-      </w:r>
-      <w:proofErr w:type="spellEnd"/>
-      <w:r>
-        <w:t xml:space="preserve"> </w:t>
-      </w:r>
-      <w:proofErr w:type="spellStart"/>
-      <w:r>
-        <w:t>systemctl</w:t>
-      </w:r>
-      <w:proofErr w:type="spellEnd"/>
-      <w:r>
-        <w:t xml:space="preserve"> stop </w:t>
-      </w:r>
-      <w:proofErr w:type="spellStart"/>
-      <w:r>
-        <w:t>NetworkManager</w:t>
-      </w:r>
-      <w:proofErr w:type="spellEnd"/>
-    </w:p>
-    <w:p>
-      <w:proofErr w:type="spellStart"/>
-      <w:r>
-        <w:t>sudo</w:t>
-      </w:r>
-      <w:proofErr w:type="spellEnd"/>
-      <w:r>
-        <w:t xml:space="preserve"> </w:t>
-      </w:r>
-      <w:proofErr w:type="spellStart"/>
-      <w:r>
-        <w:t>wpa_supplicant</w:t>
-      </w:r>
-      <w:proofErr w:type="spellEnd"/>
-      <w:r>
-        <w:t xml:space="preserve"> -</w:t>
-      </w:r>
-      <w:proofErr w:type="spellStart"/>
-      <w:r>
-        <w:t>i</w:t>
-      </w:r>
-      <w:proofErr w:type="spellEnd"/>
-      <w:r>
-        <w:t xml:space="preserve"> wlan0 -D nl80211 -c /</w:t>
-      </w:r>
-      <w:proofErr w:type="spellStart"/>
-      <w:r>
-        <w:t>etc</w:t>
-      </w:r>
-      <w:proofErr w:type="spellEnd"/>
-      <w:r>
-        <w:t>/</w:t>
-      </w:r>
-      <w:proofErr w:type="spellStart"/>
-      <w:r>
-        <w:t>wpa_supplicant</w:t>
-      </w:r>
-      <w:proofErr w:type="spellEnd"/>
-      <w:r>
-        <w:t>/wpa_supplicant-wlan0.conf</w:t>
-      </w:r>
-    </w:p>
-    <w:p>
-      <w:proofErr w:type="spellStart"/>
-      <w:r>
-        <w:t>wpa_cli</w:t>
-      </w:r>
-      <w:proofErr w:type="spellEnd"/>
-      <w:r>
-        <w:t xml:space="preserve"> </w:t>
-      </w:r>
-      <w:r>
-        <w:t>p2p_find</w:t>
-      </w:r>
-    </w:p>
-    <w:p>
-      <w:proofErr w:type="spellStart"/>
-      <w:r>
-        <w:t>ape_cli</w:t>
-      </w:r>
-      <w:proofErr w:type="spellEnd"/>
-      <w:r>
-        <w:t xml:space="preserve"> p2p_connect 2a:c2:1f:</w:t>
-      </w:r>
-      <w:proofErr w:type="gramStart"/>
-      <w:r>
-        <w:t>97:e</w:t>
-      </w:r>
-      <w:proofErr w:type="gramEnd"/>
-      <w:r>
-        <w:t xml:space="preserve">1:7c </w:t>
-      </w:r>
-      <w:proofErr w:type="spellStart"/>
-      <w:r>
-        <w:t>pbc</w:t>
-      </w:r>
-      <w:proofErr w:type="spellEnd"/>
-    </w:p>
-    <w:p/>
+      <w:pPr>
+        <w:pStyle w:val="ListParagraph"/>
+        <w:ind w:left="1440"/>
+        <w:rPr>
+          <w:b/>
+          <w:bCs/>
+        </w:rPr>
+      </w:pPr>
+    </w:p>
+    <w:p>
+      <w:pPr>
+        <w:pStyle w:val="ListParagraph"/>
+        <w:numPr>
+          <w:ilvl w:val="0"/>
+          <w:numId w:val="2"/>
+        </w:numPr>
+        <w:rPr>
+          <w:b/>
+          <w:bCs/>
+        </w:rPr>
+      </w:pPr>
+      <w:r>
+        <w:rPr>
+          <w:b/>
+          <w:bCs/>
+        </w:rPr>
+        <w:t xml:space="preserve">Pi → </w:t>
+      </w:r>
+      <w:r>
+        <w:rPr>
+          <w:b/>
+          <w:bCs/>
+        </w:rPr>
+        <w:t>GYRO</w:t>
+      </w:r>
+    </w:p>
+    <w:p>
+      <w:pPr>
+        <w:pStyle w:val="ListParagraph"/>
+        <w:numPr>
+          <w:ilvl w:val="1"/>
+          <w:numId w:val="2"/>
+        </w:numPr>
+        <w:rPr>
+          <w:b/>
+          <w:bCs/>
+        </w:rPr>
+      </w:pPr>
+      <w:r>
+        <w:t>Pi 3.3v → V</w:t>
+      </w:r>
+      <w:r>
+        <w:t>CC</w:t>
+      </w:r>
+    </w:p>
+    <w:p>
+      <w:pPr>
+        <w:pStyle w:val="ListParagraph"/>
+        <w:numPr>
+          <w:ilvl w:val="1"/>
+          <w:numId w:val="2"/>
+        </w:numPr>
+        <w:rPr>
+          <w:b/>
+          <w:bCs/>
+        </w:rPr>
+      </w:pPr>
+      <w:r>
+        <w:t>Pi GND → GND</w:t>
+      </w:r>
+    </w:p>
+    <w:p>
+      <w:pPr>
+        <w:pStyle w:val="ListParagraph"/>
+        <w:numPr>
+          <w:ilvl w:val="1"/>
+          <w:numId w:val="2"/>
+        </w:numPr>
+        <w:rPr>
+          <w:b/>
+          <w:bCs/>
+        </w:rPr>
+      </w:pPr>
+      <w:r>
+        <w:t xml:space="preserve">GPIO3 → </w:t>
+      </w:r>
+      <w:r>
+        <w:t>SCL</w:t>
+      </w:r>
+    </w:p>
+    <w:p>
+      <w:pPr>
+        <w:pStyle w:val="ListParagraph"/>
+        <w:numPr>
+          <w:ilvl w:val="1"/>
+          <w:numId w:val="2"/>
+        </w:numPr>
+        <w:rPr>
+          <w:b/>
+          <w:bCs/>
+        </w:rPr>
+      </w:pPr>
+      <w:r>
+        <w:t xml:space="preserve">GPIO2 → </w:t>
+      </w:r>
+      <w:r>
+        <w:t>SDA</w:t>
+      </w:r>
+    </w:p>
     <w:sectPr>
       <w:pgSz w:w="12240" w:h="15840"/>
       <w:pgMar w:top="720" w:right="720" w:bottom="720" w:left="720" w:header="720" w:footer="720" w:gutter="0"/>

</xml_diff>

<commit_message>
Remapped color values on board
</commit_message>
<xml_diff>
--- a/schematics.docx
+++ b/schematics.docx
@@ -714,6 +714,11 @@
       </w:r>
       <w:r>
         <w:tab/>
+      </w:r>
+      <w:r>
+        <w:tab/>
+      </w:r>
+      <w:r>
         <w:t>(ORANGE)</w:t>
       </w:r>
     </w:p>
@@ -736,6 +741,11 @@
       </w:r>
       <w:r>
         <w:tab/>
+      </w:r>
+      <w:r>
+        <w:tab/>
+      </w:r>
+      <w:r>
         <w:t>(YELLOW)</w:t>
       </w:r>
     </w:p>
@@ -758,6 +768,11 @@
       </w:r>
       <w:r>
         <w:tab/>
+      </w:r>
+      <w:r>
+        <w:tab/>
+      </w:r>
+      <w:r>
         <w:t>(BLACK)</w:t>
       </w:r>
     </w:p>
@@ -780,6 +795,11 @@
       </w:r>
       <w:r>
         <w:tab/>
+      </w:r>
+      <w:r>
+        <w:tab/>
+      </w:r>
+      <w:r>
         <w:t>(BROWN)</w:t>
       </w:r>
     </w:p>
@@ -835,7 +855,29 @@
         </w:rPr>
       </w:pPr>
       <w:r>
-        <w:t>Power → VM</w:t>
+        <w:t xml:space="preserve">POWER </w:t>
+      </w:r>
+      <w:r>
+        <w:t>→</w:t>
+      </w:r>
+      <w:r>
+        <w:t xml:space="preserve"> </w:t>
+      </w:r>
+      <w:r>
+        <w:t xml:space="preserve">Pi </w:t>
+      </w:r>
+      <w:r>
+        <w:t>5v</w:t>
+      </w:r>
+      <w:r>
+        <w:tab/>
+      </w:r>
+      <w:r>
+        <w:tab/>
+      </w:r>
+      <w:r>
+        <w:tab/>
+        <w:t>(RED)</w:t>
       </w:r>
     </w:p>
     <w:p>
@@ -851,7 +893,23 @@
         </w:rPr>
       </w:pPr>
       <w:r>
-        <w:t>Pi 3.3v → VIO</w:t>
+        <w:t>Power → VM</w:t>
+      </w:r>
+      <w:r>
+        <w:t xml:space="preserve"> </w:t>
+      </w:r>
+      <w:r>
+        <w:tab/>
+      </w:r>
+      <w:r>
+        <w:tab/>
+      </w:r>
+      <w:r>
+        <w:tab/>
+      </w:r>
+      <w:r>
+        <w:tab/>
+        <w:t>(RED)</w:t>
       </w:r>
     </w:p>
     <w:p>
@@ -864,10 +922,45 @@
         <w:rPr>
           <w:b/>
           <w:bCs/>
-        </w:rPr>
-      </w:pPr>
-      <w:r>
-        <w:t>Pi GND → GND</w:t>
+          <w:lang w:val="it-IT"/>
+        </w:rPr>
+      </w:pPr>
+      <w:r>
+        <w:rPr>
+          <w:lang w:val="it-IT"/>
+        </w:rPr>
+        <w:t>Pi 3.3v → VIO</w:t>
+      </w:r>
+      <w:r>
+        <w:rPr>
+          <w:lang w:val="it-IT"/>
+        </w:rPr>
+        <w:t xml:space="preserve"> </w:t>
+      </w:r>
+      <w:r>
+        <w:rPr>
+          <w:lang w:val="it-IT"/>
+        </w:rPr>
+        <w:tab/>
+      </w:r>
+      <w:r>
+        <w:rPr>
+          <w:lang w:val="it-IT"/>
+        </w:rPr>
+        <w:tab/>
+      </w:r>
+      <w:r>
+        <w:rPr>
+          <w:lang w:val="it-IT"/>
+        </w:rPr>
+        <w:tab/>
+      </w:r>
+      <w:r>
+        <w:rPr>
+          <w:lang w:val="it-IT"/>
+        </w:rPr>
+        <w:tab/>
+        <w:t>(GRAY)</w:t>
       </w:r>
     </w:p>
     <w:p>
@@ -883,22 +976,20 @@
         </w:rPr>
       </w:pPr>
       <w:r>
-        <w:t>Cont.</w:t>
-      </w:r>
-      <w:r>
-        <w:t xml:space="preserve"> GND </w:t>
-      </w:r>
-      <w:r>
-        <w:t>→</w:t>
+        <w:t>Pi GND → GND</w:t>
       </w:r>
       <w:r>
         <w:t xml:space="preserve"> </w:t>
       </w:r>
       <w:r>
-        <w:t xml:space="preserve">Pi </w:t>
-      </w:r>
-      <w:r>
-        <w:t>GND</w:t>
+        <w:tab/>
+      </w:r>
+      <w:r>
+        <w:tab/>
+      </w:r>
+      <w:r>
+        <w:tab/>
+        <w:t>(BLACK)</w:t>
       </w:r>
     </w:p>
     <w:p>
@@ -914,7 +1005,32 @@
         </w:rPr>
       </w:pPr>
       <w:r>
-        <w:t>GPIO14 → 1kohm → USART</w:t>
+        <w:t>Cont.</w:t>
+      </w:r>
+      <w:r>
+        <w:t xml:space="preserve"> GND </w:t>
+      </w:r>
+      <w:r>
+        <w:t>→</w:t>
+      </w:r>
+      <w:r>
+        <w:t xml:space="preserve"> </w:t>
+      </w:r>
+      <w:r>
+        <w:t xml:space="preserve">Pi </w:t>
+      </w:r>
+      <w:r>
+        <w:t>GND</w:t>
+      </w:r>
+      <w:r>
+        <w:t xml:space="preserve"> </w:t>
+      </w:r>
+      <w:r>
+        <w:tab/>
+      </w:r>
+      <w:r>
+        <w:tab/>
+        <w:t>(BROWN)</w:t>
       </w:r>
     </w:p>
     <w:p>
@@ -930,7 +1046,17 @@
         </w:rPr>
       </w:pPr>
       <w:r>
-        <w:t>GPIO18 → STEP</w:t>
+        <w:t>GPIO14 → 1kohm → USART</w:t>
+      </w:r>
+      <w:r>
+        <w:t xml:space="preserve"> </w:t>
+      </w:r>
+      <w:r>
+        <w:tab/>
+      </w:r>
+      <w:r>
+        <w:tab/>
+        <w:t>(ORANGE)</w:t>
       </w:r>
     </w:p>
     <w:p>
@@ -946,10 +1072,17 @@
         </w:rPr>
       </w:pPr>
       <w:r>
-        <w:t>GPIO23 → DIR</w:t>
-      </w:r>
-      <w:r>
-        <w:tab/>
+        <w:t>GPIO18 → STEP</w:t>
+      </w:r>
+      <w:r>
+        <w:tab/>
+      </w:r>
+      <w:r>
+        <w:tab/>
+      </w:r>
+      <w:r>
+        <w:tab/>
+        <w:t>(YELLOW)</w:t>
       </w:r>
     </w:p>
     <w:p>
@@ -965,7 +1098,49 @@
         </w:rPr>
       </w:pPr>
       <w:r>
+        <w:t>GPIO23 → DIR</w:t>
+      </w:r>
+      <w:r>
+        <w:tab/>
+      </w:r>
+      <w:r>
+        <w:tab/>
+      </w:r>
+      <w:r>
+        <w:tab/>
+      </w:r>
+      <w:r>
+        <w:tab/>
+        <w:t>(GREEN)</w:t>
+      </w:r>
+    </w:p>
+    <w:p>
+      <w:pPr>
+        <w:pStyle w:val="ListParagraph"/>
+        <w:numPr>
+          <w:ilvl w:val="1"/>
+          <w:numId w:val="2"/>
+        </w:numPr>
+        <w:rPr>
+          <w:b/>
+          <w:bCs/>
+        </w:rPr>
+      </w:pPr>
+      <w:r>
         <w:t>GPIO24 → EN</w:t>
+      </w:r>
+      <w:r>
+        <w:tab/>
+      </w:r>
+      <w:r>
+        <w:tab/>
+      </w:r>
+      <w:r>
+        <w:tab/>
+      </w:r>
+      <w:r>
+        <w:tab/>
+        <w:t>(BLUE)</w:t>
       </w:r>
     </w:p>
     <w:p>
@@ -1018,10 +1193,22 @@
         </w:rPr>
       </w:pPr>
       <w:r>
-        <w:t>Pi 3.3v → V</w:t>
-      </w:r>
-      <w:r>
-        <w:t>CC</w:t>
+        <w:t>Pi 3.3v → VCC</w:t>
+      </w:r>
+      <w:r>
+        <w:tab/>
+      </w:r>
+      <w:r>
+        <w:tab/>
+      </w:r>
+      <w:r>
+        <w:tab/>
+      </w:r>
+      <w:r>
+        <w:tab/>
+      </w:r>
+      <w:r>
+        <w:t>(GRAY)</w:t>
       </w:r>
     </w:p>
     <w:p>
@@ -1039,6 +1226,16 @@
       <w:r>
         <w:t>Pi GND → GND</w:t>
       </w:r>
+      <w:r>
+        <w:tab/>
+      </w:r>
+      <w:r>
+        <w:tab/>
+      </w:r>
+      <w:r>
+        <w:tab/>
+        <w:t>(BLACK)</w:t>
+      </w:r>
     </w:p>
     <w:p>
       <w:pPr>
@@ -1053,10 +1250,20 @@
         </w:rPr>
       </w:pPr>
       <w:r>
-        <w:t xml:space="preserve">GPIO3 → </w:t>
-      </w:r>
-      <w:r>
-        <w:t>SCL</w:t>
+        <w:t>GPIO2 → SDA</w:t>
+      </w:r>
+      <w:r>
+        <w:tab/>
+      </w:r>
+      <w:r>
+        <w:tab/>
+      </w:r>
+      <w:r>
+        <w:tab/>
+      </w:r>
+      <w:r>
+        <w:tab/>
+        <w:t>(PURPLE)</w:t>
       </w:r>
     </w:p>
     <w:p>
@@ -1072,10 +1279,28 @@
         </w:rPr>
       </w:pPr>
       <w:r>
-        <w:t xml:space="preserve">GPIO2 → </w:t>
-      </w:r>
-      <w:r>
-        <w:t>SDA</w:t>
+        <w:t>GPIO3 → SCL</w:t>
+      </w:r>
+      <w:r>
+        <w:tab/>
+      </w:r>
+      <w:r>
+        <w:tab/>
+      </w:r>
+      <w:r>
+        <w:tab/>
+      </w:r>
+      <w:r>
+        <w:tab/>
+      </w:r>
+      <w:r>
+        <w:t>(</w:t>
+      </w:r>
+      <w:r>
+        <w:t>BROWN</w:t>
+      </w:r>
+      <w:r>
+        <w:t>)</w:t>
       </w:r>
     </w:p>
     <w:sectPr>

</xml_diff>